<commit_message>
docs: ajout de l'annexe PV de deliberation du CTAE (session n 0170)
- CR enrichi : reference du PV, recevabilite du rapport, ventilation des
  60 recommandations (NIES 10 forme + 42 fond ; PARC 4 + 4)
- Annexe complete : identification de la session, composition du comite,
  ordre du jour, tableau des recommandations par volet, conclusion du PV
  et signataires

Co-Authored-By: Claude Opus 5 <noreply@anthropic.com>
Claude-Session: https://claude.ai/code/session_01TUQMzwRPUfnpKk2Mhgas5i
</commit_message>
<xml_diff>
--- a/docs/CR_NIES_PAR_BARRAGE_KENO.docx
+++ b/docs/CR_NIES_PAR_BARRAGE_KENO.docx
@@ -1958,7 +1958,7 @@
           <w:sz w:val="21"/>
           <w:szCs w:val="21"/>
         </w:rPr>
-        <w:t xml:space="preserve">LA SESSION DU CTAE DU 14 JUILLET 2026 ET LES SUITES DONNÉES</w:t>
+        <w:t xml:space="preserve">LA SESSION DU CTAE DU 14 JUILLET 2026 — PV DE DÉLIBÉRATION N° 0170</w:t>
       </w:r>
     </w:p>
     <w:p>
@@ -1979,7 +1979,7 @@
           <w:sz w:val="18"/>
           <w:szCs w:val="18"/>
         </w:rPr>
-        <w:t xml:space="preserve">60 recommandations</w:t>
+        <w:t xml:space="preserve">Session n° 0170/CTAE/AGEE/DG/CONAKRY</w:t>
       </w:r>
       <w:r>
         <w:rPr>
@@ -1988,7 +1988,86 @@
           <w:sz w:val="18"/>
           <w:szCs w:val="18"/>
         </w:rPr>
-        <w:t xml:space="preserve"> formulées sur la forme et sur le fond, </w:t>
+        <w:t xml:space="preserve"> tenue le mardi 14 juillet 2026 de 09h43 à 13h45, salle de conférence de l'UNESCO, sous la présidence de </w:t>
+      </w:r>
+      <w:r>
+        <w:rPr>
+          <w:rFonts w:ascii="Calibri" w:cs="Calibri" w:eastAsia="Calibri" w:hAnsi="Calibri"/>
+          <w:b/>
+          <w:bCs/>
+          <w:color w:val="000000"/>
+          <w:sz w:val="18"/>
+          <w:szCs w:val="18"/>
+        </w:rPr>
+        <w:t xml:space="preserve">M. Cyril ABOLY</w:t>
+      </w:r>
+      <w:r>
+        <w:rPr>
+          <w:rFonts w:ascii="Calibri" w:cs="Calibri" w:eastAsia="Calibri" w:hAnsi="Calibri"/>
+          <w:color w:val="000000"/>
+          <w:sz w:val="18"/>
+          <w:szCs w:val="18"/>
+        </w:rPr>
+        <w:t xml:space="preserve">, Conseiller Juridique de Madame la Ministre — 8 institutions publiques, la société civile, le promoteur et le consultant représentés.</w:t>
+      </w:r>
+    </w:p>
+    <w:p>
+      <w:pPr>
+        <w:pStyle w:val="ListParagraph"/>
+        <w:numPr>
+          <w:ilvl w:val="0"/>
+          <w:numId w:val="2"/>
+        </w:numPr>
+        <w:spacing w:after="40" w:line="228"/>
+      </w:pPr>
+      <w:r>
+        <w:rPr>
+          <w:rFonts w:ascii="Calibri" w:cs="Calibri" w:eastAsia="Calibri" w:hAnsi="Calibri"/>
+          <w:color w:val="000000"/>
+          <w:sz w:val="18"/>
+          <w:szCs w:val="18"/>
+        </w:rPr>
+        <w:t xml:space="preserve">Le rapport a été jugé </w:t>
+      </w:r>
+      <w:r>
+        <w:rPr>
+          <w:rFonts w:ascii="Calibri" w:cs="Calibri" w:eastAsia="Calibri" w:hAnsi="Calibri"/>
+          <w:b/>
+          <w:bCs/>
+          <w:color w:val="1E6B3A"/>
+          <w:sz w:val="18"/>
+          <w:szCs w:val="18"/>
+        </w:rPr>
+        <w:t xml:space="preserve">RECEVABLE</w:t>
+      </w:r>
+      <w:r>
+        <w:rPr>
+          <w:rFonts w:ascii="Calibri" w:cs="Calibri" w:eastAsia="Calibri" w:hAnsi="Calibri"/>
+          <w:color w:val="000000"/>
+          <w:sz w:val="18"/>
+          <w:szCs w:val="18"/>
+        </w:rPr>
+        <w:t xml:space="preserve">, la délivrance de l'Autorisation Environnementale étant subordonnée à la prise en compte effective des </w:t>
+      </w:r>
+      <w:r>
+        <w:rPr>
+          <w:rFonts w:ascii="Calibri" w:cs="Calibri" w:eastAsia="Calibri" w:hAnsi="Calibri"/>
+          <w:b/>
+          <w:bCs/>
+          <w:color w:val="000000"/>
+          <w:sz w:val="18"/>
+          <w:szCs w:val="18"/>
+        </w:rPr>
+        <w:t xml:space="preserve">60 recommandations</w:t>
+      </w:r>
+      <w:r>
+        <w:rPr>
+          <w:rFonts w:ascii="Calibri" w:cs="Calibri" w:eastAsia="Calibri" w:hAnsi="Calibri"/>
+          <w:color w:val="000000"/>
+          <w:sz w:val="18"/>
+          <w:szCs w:val="18"/>
+        </w:rPr>
+        <w:t xml:space="preserve"> (NIES : 10 sur la forme, 42 sur le fond ; PARC : 4 et 4) — </w:t>
       </w:r>
       <w:r>
         <w:rPr>
@@ -3273,6 +3352,2029 @@
           <w:szCs w:val="15"/>
         </w:rPr>
         <w:t xml:space="preserve">Sources : lettre de transmission n° 081/CGDEM-AEDD/EDG/ID/2026 ; Note d'analyse comparative FICHTNER 2017 / CGDEM 2026, CGDEM-AEDD SARLU, août 2026 ; PV de délibération du CTAE du 14 juillet 2026.</w:t>
+      </w:r>
+    </w:p>
+    <w:p>
+      <w:r>
+        <w:br w:type="page"/>
+      </w:r>
+    </w:p>
+    <w:p>
+      <w:pPr>
+        <w:spacing w:after="0"/>
+        <w:jc w:val="center"/>
+      </w:pPr>
+      <w:r>
+        <w:rPr>
+          <w:rFonts w:ascii="Calibri" w:cs="Calibri" w:eastAsia="Calibri" w:hAnsi="Calibri"/>
+          <w:b/>
+          <w:bCs/>
+          <w:color w:val="1F3864"/>
+          <w:sz w:val="26"/>
+          <w:szCs w:val="26"/>
+        </w:rPr>
+        <w:t xml:space="preserve">ANNEXE</w:t>
+      </w:r>
+    </w:p>
+    <w:p>
+      <w:pPr>
+        <w:pBdr>
+          <w:bottom w:val="single" w:color="1F3864" w:sz="12" w:space="4"/>
+        </w:pBdr>
+        <w:spacing w:after="140"/>
+        <w:jc w:val="center"/>
+      </w:pPr>
+      <w:r>
+        <w:rPr>
+          <w:rFonts w:ascii="Calibri" w:cs="Calibri" w:eastAsia="Calibri" w:hAnsi="Calibri"/>
+          <w:b/>
+          <w:bCs/>
+          <w:color w:val="2E74B5"/>
+          <w:sz w:val="20"/>
+          <w:szCs w:val="20"/>
+        </w:rPr>
+        <w:t xml:space="preserve">Procès-verbal de délibération du CTAE — Session n° 0170/CTAE/AGEE/DG/CONAKRY du 14/07/2026</w:t>
+      </w:r>
+    </w:p>
+    <w:tbl>
+      <w:tblPr>
+        <w:tblW w:type="dxa" w:w="9746"/>
+        <w:tblBorders>
+          <w:top w:val="single" w:color="auto" w:sz="4"/>
+          <w:left w:val="single" w:color="auto" w:sz="4"/>
+          <w:bottom w:val="single" w:color="auto" w:sz="4"/>
+          <w:right w:val="single" w:color="auto" w:sz="4"/>
+          <w:insideH w:val="single" w:color="auto" w:sz="4"/>
+          <w:insideV w:val="single" w:color="auto" w:sz="4"/>
+        </w:tblBorders>
+      </w:tblPr>
+      <w:tblGrid>
+        <w:gridCol w:w="2100"/>
+        <w:gridCol w:w="2773"/>
+        <w:gridCol w:w="2100"/>
+        <w:gridCol w:w="2773"/>
+      </w:tblGrid>
+      <w:tr>
+        <w:trPr>
+          <w:tblHeader/>
+        </w:trPr>
+        <w:tc>
+          <w:tcPr>
+            <w:tcW w:type="dxa" w:w="2100"/>
+            <w:tcBorders>
+              <w:top w:val="single" w:color="BFBFBF" w:sz="4"/>
+              <w:left w:val="single" w:color="BFBFBF" w:sz="4"/>
+              <w:bottom w:val="single" w:color="BFBFBF" w:sz="4"/>
+              <w:right w:val="single" w:color="BFBFBF" w:sz="4"/>
+            </w:tcBorders>
+            <w:shd w:fill="DEEAF6" w:color="auto" w:val="clear"/>
+            <w:tcMar>
+              <w:top w:type="dxa" w:w="36"/>
+              <w:left w:type="dxa" w:w="70"/>
+              <w:bottom w:type="dxa" w:w="36"/>
+              <w:right w:type="dxa" w:w="70"/>
+            </w:tcMar>
+            <w:vAlign w:val="center"/>
+          </w:tcPr>
+          <w:p>
+            <w:pPr>
+              <w:spacing w:after="26" w:before="26" w:line="216"/>
+            </w:pPr>
+            <w:r>
+              <w:rPr>
+                <w:rFonts w:ascii="Calibri" w:cs="Calibri" w:eastAsia="Calibri" w:hAnsi="Calibri"/>
+                <w:b/>
+                <w:bCs/>
+                <w:color w:val="000000"/>
+                <w:sz w:val="17"/>
+                <w:szCs w:val="17"/>
+              </w:rPr>
+              <w:t xml:space="preserve">Date et horaires</w:t>
+            </w:r>
+          </w:p>
+        </w:tc>
+        <w:tc>
+          <w:tcPr>
+            <w:tcW w:type="dxa" w:w="2773"/>
+            <w:tcBorders>
+              <w:top w:val="single" w:color="BFBFBF" w:sz="4"/>
+              <w:left w:val="single" w:color="BFBFBF" w:sz="4"/>
+              <w:bottom w:val="single" w:color="BFBFBF" w:sz="4"/>
+              <w:right w:val="single" w:color="BFBFBF" w:sz="4"/>
+            </w:tcBorders>
+            <w:tcMar>
+              <w:top w:type="dxa" w:w="36"/>
+              <w:left w:type="dxa" w:w="70"/>
+              <w:bottom w:type="dxa" w:w="36"/>
+              <w:right w:type="dxa" w:w="70"/>
+            </w:tcMar>
+            <w:vAlign w:val="center"/>
+          </w:tcPr>
+          <w:p>
+            <w:pPr>
+              <w:spacing w:after="26" w:before="26" w:line="216"/>
+            </w:pPr>
+            <w:r>
+              <w:rPr>
+                <w:rFonts w:ascii="Calibri" w:cs="Calibri" w:eastAsia="Calibri" w:hAnsi="Calibri"/>
+                <w:color w:val="000000"/>
+                <w:sz w:val="17"/>
+                <w:szCs w:val="17"/>
+              </w:rPr>
+              <w:t xml:space="preserve">Mardi 14 juillet 2026, 09h43 – 13h45</w:t>
+            </w:r>
+          </w:p>
+        </w:tc>
+        <w:tc>
+          <w:tcPr>
+            <w:tcW w:type="dxa" w:w="2100"/>
+            <w:tcBorders>
+              <w:top w:val="single" w:color="BFBFBF" w:sz="4"/>
+              <w:left w:val="single" w:color="BFBFBF" w:sz="4"/>
+              <w:bottom w:val="single" w:color="BFBFBF" w:sz="4"/>
+              <w:right w:val="single" w:color="BFBFBF" w:sz="4"/>
+            </w:tcBorders>
+            <w:shd w:fill="DEEAF6" w:color="auto" w:val="clear"/>
+            <w:tcMar>
+              <w:top w:type="dxa" w:w="36"/>
+              <w:left w:type="dxa" w:w="70"/>
+              <w:bottom w:type="dxa" w:w="36"/>
+              <w:right w:type="dxa" w:w="70"/>
+            </w:tcMar>
+            <w:vAlign w:val="center"/>
+          </w:tcPr>
+          <w:p>
+            <w:pPr>
+              <w:spacing w:after="26" w:before="26" w:line="216"/>
+            </w:pPr>
+            <w:r>
+              <w:rPr>
+                <w:rFonts w:ascii="Calibri" w:cs="Calibri" w:eastAsia="Calibri" w:hAnsi="Calibri"/>
+                <w:b/>
+                <w:bCs/>
+                <w:color w:val="000000"/>
+                <w:sz w:val="17"/>
+                <w:szCs w:val="17"/>
+              </w:rPr>
+              <w:t xml:space="preserve">Lieu</w:t>
+            </w:r>
+          </w:p>
+        </w:tc>
+        <w:tc>
+          <w:tcPr>
+            <w:tcW w:type="dxa" w:w="2773"/>
+            <w:tcBorders>
+              <w:top w:val="single" w:color="BFBFBF" w:sz="4"/>
+              <w:left w:val="single" w:color="BFBFBF" w:sz="4"/>
+              <w:bottom w:val="single" w:color="BFBFBF" w:sz="4"/>
+              <w:right w:val="single" w:color="BFBFBF" w:sz="4"/>
+            </w:tcBorders>
+            <w:tcMar>
+              <w:top w:type="dxa" w:w="36"/>
+              <w:left w:type="dxa" w:w="70"/>
+              <w:bottom w:type="dxa" w:w="36"/>
+              <w:right w:type="dxa" w:w="70"/>
+            </w:tcMar>
+            <w:vAlign w:val="center"/>
+          </w:tcPr>
+          <w:p>
+            <w:pPr>
+              <w:spacing w:after="26" w:before="26" w:line="216"/>
+            </w:pPr>
+            <w:r>
+              <w:rPr>
+                <w:rFonts w:ascii="Calibri" w:cs="Calibri" w:eastAsia="Calibri" w:hAnsi="Calibri"/>
+                <w:color w:val="000000"/>
+                <w:sz w:val="17"/>
+                <w:szCs w:val="17"/>
+              </w:rPr>
+              <w:t xml:space="preserve">Salle de conférence de l'UNESCO, Conakry</w:t>
+            </w:r>
+          </w:p>
+        </w:tc>
+      </w:tr>
+      <w:tr>
+        <w:trPr>
+          <w:tblHeader w:val="false"/>
+        </w:trPr>
+        <w:tc>
+          <w:tcPr>
+            <w:tcW w:type="dxa" w:w="2100"/>
+            <w:tcBorders>
+              <w:top w:val="single" w:color="BFBFBF" w:sz="4"/>
+              <w:left w:val="single" w:color="BFBFBF" w:sz="4"/>
+              <w:bottom w:val="single" w:color="BFBFBF" w:sz="4"/>
+              <w:right w:val="single" w:color="BFBFBF" w:sz="4"/>
+            </w:tcBorders>
+            <w:shd w:fill="DEEAF6" w:color="auto" w:val="clear"/>
+            <w:tcMar>
+              <w:top w:type="dxa" w:w="36"/>
+              <w:left w:type="dxa" w:w="70"/>
+              <w:bottom w:type="dxa" w:w="36"/>
+              <w:right w:type="dxa" w:w="70"/>
+            </w:tcMar>
+            <w:vAlign w:val="center"/>
+          </w:tcPr>
+          <w:p>
+            <w:pPr>
+              <w:spacing w:after="26" w:before="26" w:line="216"/>
+            </w:pPr>
+            <w:r>
+              <w:rPr>
+                <w:rFonts w:ascii="Calibri" w:cs="Calibri" w:eastAsia="Calibri" w:hAnsi="Calibri"/>
+                <w:b/>
+                <w:bCs/>
+                <w:color w:val="000000"/>
+                <w:sz w:val="17"/>
+                <w:szCs w:val="17"/>
+              </w:rPr>
+              <w:t xml:space="preserve">Président de séance</w:t>
+            </w:r>
+          </w:p>
+        </w:tc>
+        <w:tc>
+          <w:tcPr>
+            <w:tcW w:type="dxa" w:w="2773"/>
+            <w:tcBorders>
+              <w:top w:val="single" w:color="BFBFBF" w:sz="4"/>
+              <w:left w:val="single" w:color="BFBFBF" w:sz="4"/>
+              <w:bottom w:val="single" w:color="BFBFBF" w:sz="4"/>
+              <w:right w:val="single" w:color="BFBFBF" w:sz="4"/>
+            </w:tcBorders>
+            <w:shd w:fill="F4F8FC" w:color="auto" w:val="clear"/>
+            <w:tcMar>
+              <w:top w:type="dxa" w:w="36"/>
+              <w:left w:type="dxa" w:w="70"/>
+              <w:bottom w:type="dxa" w:w="36"/>
+              <w:right w:type="dxa" w:w="70"/>
+            </w:tcMar>
+            <w:vAlign w:val="center"/>
+          </w:tcPr>
+          <w:p>
+            <w:pPr>
+              <w:spacing w:after="26" w:before="26" w:line="216"/>
+            </w:pPr>
+            <w:r>
+              <w:rPr>
+                <w:rFonts w:ascii="Calibri" w:cs="Calibri" w:eastAsia="Calibri" w:hAnsi="Calibri"/>
+                <w:color w:val="000000"/>
+                <w:sz w:val="17"/>
+                <w:szCs w:val="17"/>
+              </w:rPr>
+              <w:t xml:space="preserve">M. Cyril ABOLY, Conseiller Juridique / MEDD</w:t>
+            </w:r>
+          </w:p>
+        </w:tc>
+        <w:tc>
+          <w:tcPr>
+            <w:tcW w:type="dxa" w:w="2100"/>
+            <w:tcBorders>
+              <w:top w:val="single" w:color="BFBFBF" w:sz="4"/>
+              <w:left w:val="single" w:color="BFBFBF" w:sz="4"/>
+              <w:bottom w:val="single" w:color="BFBFBF" w:sz="4"/>
+              <w:right w:val="single" w:color="BFBFBF" w:sz="4"/>
+            </w:tcBorders>
+            <w:shd w:fill="DEEAF6" w:color="auto" w:val="clear"/>
+            <w:tcMar>
+              <w:top w:type="dxa" w:w="36"/>
+              <w:left w:type="dxa" w:w="70"/>
+              <w:bottom w:type="dxa" w:w="36"/>
+              <w:right w:type="dxa" w:w="70"/>
+            </w:tcMar>
+            <w:vAlign w:val="center"/>
+          </w:tcPr>
+          <w:p>
+            <w:pPr>
+              <w:spacing w:after="26" w:before="26" w:line="216"/>
+            </w:pPr>
+            <w:r>
+              <w:rPr>
+                <w:rFonts w:ascii="Calibri" w:cs="Calibri" w:eastAsia="Calibri" w:hAnsi="Calibri"/>
+                <w:b/>
+                <w:bCs/>
+                <w:color w:val="000000"/>
+                <w:sz w:val="17"/>
+                <w:szCs w:val="17"/>
+              </w:rPr>
+              <w:t xml:space="preserve">Rapporteur</w:t>
+            </w:r>
+          </w:p>
+        </w:tc>
+        <w:tc>
+          <w:tcPr>
+            <w:tcW w:type="dxa" w:w="2773"/>
+            <w:tcBorders>
+              <w:top w:val="single" w:color="BFBFBF" w:sz="4"/>
+              <w:left w:val="single" w:color="BFBFBF" w:sz="4"/>
+              <w:bottom w:val="single" w:color="BFBFBF" w:sz="4"/>
+              <w:right w:val="single" w:color="BFBFBF" w:sz="4"/>
+            </w:tcBorders>
+            <w:shd w:fill="F4F8FC" w:color="auto" w:val="clear"/>
+            <w:tcMar>
+              <w:top w:type="dxa" w:w="36"/>
+              <w:left w:type="dxa" w:w="70"/>
+              <w:bottom w:type="dxa" w:w="36"/>
+              <w:right w:type="dxa" w:w="70"/>
+            </w:tcMar>
+            <w:vAlign w:val="center"/>
+          </w:tcPr>
+          <w:p>
+            <w:pPr>
+              <w:spacing w:after="26" w:before="26" w:line="216"/>
+            </w:pPr>
+            <w:r>
+              <w:rPr>
+                <w:rFonts w:ascii="Calibri" w:cs="Calibri" w:eastAsia="Calibri" w:hAnsi="Calibri"/>
+                <w:color w:val="000000"/>
+                <w:sz w:val="17"/>
+                <w:szCs w:val="17"/>
+              </w:rPr>
+              <w:t xml:space="preserve">M. Sory DOUMBOUYA, Chef Service Normes et Réglementation / AGEE</w:t>
+            </w:r>
+          </w:p>
+        </w:tc>
+      </w:tr>
+      <w:tr>
+        <w:trPr>
+          <w:tblHeader w:val="false"/>
+        </w:trPr>
+        <w:tc>
+          <w:tcPr>
+            <w:tcW w:type="dxa" w:w="2100"/>
+            <w:tcBorders>
+              <w:top w:val="single" w:color="BFBFBF" w:sz="4"/>
+              <w:left w:val="single" w:color="BFBFBF" w:sz="4"/>
+              <w:bottom w:val="single" w:color="BFBFBF" w:sz="4"/>
+              <w:right w:val="single" w:color="BFBFBF" w:sz="4"/>
+            </w:tcBorders>
+            <w:shd w:fill="DEEAF6" w:color="auto" w:val="clear"/>
+            <w:tcMar>
+              <w:top w:type="dxa" w:w="36"/>
+              <w:left w:type="dxa" w:w="70"/>
+              <w:bottom w:type="dxa" w:w="36"/>
+              <w:right w:type="dxa" w:w="70"/>
+            </w:tcMar>
+            <w:vAlign w:val="center"/>
+          </w:tcPr>
+          <w:p>
+            <w:pPr>
+              <w:spacing w:after="26" w:before="26" w:line="216"/>
+            </w:pPr>
+            <w:r>
+              <w:rPr>
+                <w:rFonts w:ascii="Calibri" w:cs="Calibri" w:eastAsia="Calibri" w:hAnsi="Calibri"/>
+                <w:b/>
+                <w:bCs/>
+                <w:color w:val="000000"/>
+                <w:sz w:val="17"/>
+                <w:szCs w:val="17"/>
+              </w:rPr>
+              <w:t xml:space="preserve">Modérateur</w:t>
+            </w:r>
+          </w:p>
+        </w:tc>
+        <w:tc>
+          <w:tcPr>
+            <w:tcW w:type="dxa" w:w="2773"/>
+            <w:tcBorders>
+              <w:top w:val="single" w:color="BFBFBF" w:sz="4"/>
+              <w:left w:val="single" w:color="BFBFBF" w:sz="4"/>
+              <w:bottom w:val="single" w:color="BFBFBF" w:sz="4"/>
+              <w:right w:val="single" w:color="BFBFBF" w:sz="4"/>
+            </w:tcBorders>
+            <w:tcMar>
+              <w:top w:type="dxa" w:w="36"/>
+              <w:left w:type="dxa" w:w="70"/>
+              <w:bottom w:type="dxa" w:w="36"/>
+              <w:right w:type="dxa" w:w="70"/>
+            </w:tcMar>
+            <w:vAlign w:val="center"/>
+          </w:tcPr>
+          <w:p>
+            <w:pPr>
+              <w:spacing w:after="26" w:before="26" w:line="216"/>
+            </w:pPr>
+            <w:r>
+              <w:rPr>
+                <w:rFonts w:ascii="Calibri" w:cs="Calibri" w:eastAsia="Calibri" w:hAnsi="Calibri"/>
+                <w:color w:val="000000"/>
+                <w:sz w:val="17"/>
+                <w:szCs w:val="17"/>
+              </w:rPr>
+              <w:t xml:space="preserve">M. Mamadou Bhoye SOUARÉ (AGEE)</w:t>
+            </w:r>
+          </w:p>
+        </w:tc>
+        <w:tc>
+          <w:tcPr>
+            <w:tcW w:type="dxa" w:w="2100"/>
+            <w:tcBorders>
+              <w:top w:val="single" w:color="BFBFBF" w:sz="4"/>
+              <w:left w:val="single" w:color="BFBFBF" w:sz="4"/>
+              <w:bottom w:val="single" w:color="BFBFBF" w:sz="4"/>
+              <w:right w:val="single" w:color="BFBFBF" w:sz="4"/>
+            </w:tcBorders>
+            <w:shd w:fill="DEEAF6" w:color="auto" w:val="clear"/>
+            <w:tcMar>
+              <w:top w:type="dxa" w:w="36"/>
+              <w:left w:type="dxa" w:w="70"/>
+              <w:bottom w:type="dxa" w:w="36"/>
+              <w:right w:type="dxa" w:w="70"/>
+            </w:tcMar>
+            <w:vAlign w:val="center"/>
+          </w:tcPr>
+          <w:p>
+            <w:pPr>
+              <w:spacing w:after="26" w:before="26" w:line="216"/>
+            </w:pPr>
+            <w:r>
+              <w:rPr>
+                <w:rFonts w:ascii="Calibri" w:cs="Calibri" w:eastAsia="Calibri" w:hAnsi="Calibri"/>
+                <w:b/>
+                <w:bCs/>
+                <w:color w:val="000000"/>
+                <w:sz w:val="17"/>
+                <w:szCs w:val="17"/>
+              </w:rPr>
+              <w:t xml:space="preserve">Base légale</w:t>
+            </w:r>
+          </w:p>
+        </w:tc>
+        <w:tc>
+          <w:tcPr>
+            <w:tcW w:type="dxa" w:w="2773"/>
+            <w:tcBorders>
+              <w:top w:val="single" w:color="BFBFBF" w:sz="4"/>
+              <w:left w:val="single" w:color="BFBFBF" w:sz="4"/>
+              <w:bottom w:val="single" w:color="BFBFBF" w:sz="4"/>
+              <w:right w:val="single" w:color="BFBFBF" w:sz="4"/>
+            </w:tcBorders>
+            <w:tcMar>
+              <w:top w:type="dxa" w:w="36"/>
+              <w:left w:type="dxa" w:w="70"/>
+              <w:bottom w:type="dxa" w:w="36"/>
+              <w:right w:type="dxa" w:w="70"/>
+            </w:tcMar>
+            <w:vAlign w:val="center"/>
+          </w:tcPr>
+          <w:p>
+            <w:pPr>
+              <w:spacing w:after="26" w:before="26" w:line="216"/>
+            </w:pPr>
+            <w:r>
+              <w:rPr>
+                <w:rFonts w:ascii="Calibri" w:cs="Calibri" w:eastAsia="Calibri" w:hAnsi="Calibri"/>
+                <w:color w:val="000000"/>
+                <w:sz w:val="17"/>
+                <w:szCs w:val="17"/>
+              </w:rPr>
+              <w:t xml:space="preserve">Article 28 du Code de l'environnement</w:t>
+            </w:r>
+          </w:p>
+        </w:tc>
+      </w:tr>
+    </w:tbl>
+    <w:p>
+      <w:pPr>
+        <w:pBdr>
+          <w:bottom w:val="single" w:color="2E74B5" w:sz="8" w:space="2"/>
+        </w:pBdr>
+        <w:spacing w:after="90" w:before="200"/>
+      </w:pPr>
+      <w:r>
+        <w:rPr>
+          <w:rFonts w:ascii="Calibri" w:cs="Calibri" w:eastAsia="Calibri" w:hAnsi="Calibri"/>
+          <w:b/>
+          <w:bCs/>
+          <w:color w:val="2E74B5"/>
+          <w:sz w:val="21"/>
+          <w:szCs w:val="21"/>
+        </w:rPr>
+        <w:t xml:space="preserve">A1. </w:t>
+      </w:r>
+      <w:r>
+        <w:rPr>
+          <w:rFonts w:ascii="Calibri" w:cs="Calibri" w:eastAsia="Calibri" w:hAnsi="Calibri"/>
+          <w:b/>
+          <w:bCs/>
+          <w:color w:val="1F3864"/>
+          <w:sz w:val="21"/>
+          <w:szCs w:val="21"/>
+        </w:rPr>
+        <w:t xml:space="preserve">COMPOSITION DU COMITÉ</w:t>
+      </w:r>
+    </w:p>
+    <w:p>
+      <w:pPr>
+        <w:spacing w:after="60" w:before="0" w:line="230"/>
+        <w:jc w:val="both"/>
+      </w:pPr>
+      <w:r>
+        <w:rPr>
+          <w:rFonts w:ascii="Calibri" w:cs="Calibri" w:eastAsia="Calibri" w:hAnsi="Calibri"/>
+          <w:b/>
+          <w:bCs/>
+          <w:color w:val="000000"/>
+          <w:sz w:val="19"/>
+          <w:szCs w:val="19"/>
+        </w:rPr>
+        <w:t xml:space="preserve">MEDD</w:t>
+      </w:r>
+      <w:r>
+        <w:rPr>
+          <w:rFonts w:ascii="Calibri" w:cs="Calibri" w:eastAsia="Calibri" w:hAnsi="Calibri"/>
+          <w:color w:val="000000"/>
+          <w:sz w:val="19"/>
+          <w:szCs w:val="19"/>
+        </w:rPr>
+        <w:t xml:space="preserve"> — Cabinet (Conseiller Juridique), Direction Générale de l'AGEE, Direction Nationale de l'Environnement · </w:t>
+      </w:r>
+      <w:r>
+        <w:rPr>
+          <w:rFonts w:ascii="Calibri" w:cs="Calibri" w:eastAsia="Calibri" w:hAnsi="Calibri"/>
+          <w:b/>
+          <w:bCs/>
+          <w:color w:val="000000"/>
+          <w:sz w:val="19"/>
+          <w:szCs w:val="19"/>
+        </w:rPr>
+        <w:t xml:space="preserve">Ministère de l'Énergie</w:t>
+      </w:r>
+      <w:r>
+        <w:rPr>
+          <w:rFonts w:ascii="Calibri" w:cs="Calibri" w:eastAsia="Calibri" w:hAnsi="Calibri"/>
+          <w:color w:val="000000"/>
+          <w:sz w:val="19"/>
+          <w:szCs w:val="19"/>
+        </w:rPr>
+        <w:t xml:space="preserve"> — Bureau de Stratégie et de Développement · </w:t>
+      </w:r>
+      <w:r>
+        <w:rPr>
+          <w:rFonts w:ascii="Calibri" w:cs="Calibri" w:eastAsia="Calibri" w:hAnsi="Calibri"/>
+          <w:b/>
+          <w:bCs/>
+          <w:color w:val="000000"/>
+          <w:sz w:val="19"/>
+          <w:szCs w:val="19"/>
+        </w:rPr>
+        <w:t xml:space="preserve">MATD</w:t>
+      </w:r>
+      <w:r>
+        <w:rPr>
+          <w:rFonts w:ascii="Calibri" w:cs="Calibri" w:eastAsia="Calibri" w:hAnsi="Calibri"/>
+          <w:color w:val="000000"/>
+          <w:sz w:val="19"/>
+          <w:szCs w:val="19"/>
+        </w:rPr>
+        <w:t xml:space="preserve"> — Direction Nationale de l'Administration du Territoire · </w:t>
+      </w:r>
+      <w:r>
+        <w:rPr>
+          <w:rFonts w:ascii="Calibri" w:cs="Calibri" w:eastAsia="Calibri" w:hAnsi="Calibri"/>
+          <w:b/>
+          <w:bCs/>
+          <w:color w:val="000000"/>
+          <w:sz w:val="19"/>
+          <w:szCs w:val="19"/>
+        </w:rPr>
+        <w:t xml:space="preserve">MAHH</w:t>
+      </w:r>
+      <w:r>
+        <w:rPr>
+          <w:rFonts w:ascii="Calibri" w:cs="Calibri" w:eastAsia="Calibri" w:hAnsi="Calibri"/>
+          <w:color w:val="000000"/>
+          <w:sz w:val="19"/>
+          <w:szCs w:val="19"/>
+        </w:rPr>
+        <w:t xml:space="preserve"> — Direction Nationale de l'Hydraulique · </w:t>
+      </w:r>
+      <w:r>
+        <w:rPr>
+          <w:rFonts w:ascii="Calibri" w:cs="Calibri" w:eastAsia="Calibri" w:hAnsi="Calibri"/>
+          <w:b/>
+          <w:bCs/>
+          <w:color w:val="000000"/>
+          <w:sz w:val="19"/>
+          <w:szCs w:val="19"/>
+        </w:rPr>
+        <w:t xml:space="preserve">Ministère de l'Agriculture</w:t>
+      </w:r>
+      <w:r>
+        <w:rPr>
+          <w:rFonts w:ascii="Calibri" w:cs="Calibri" w:eastAsia="Calibri" w:hAnsi="Calibri"/>
+          <w:color w:val="000000"/>
+          <w:sz w:val="19"/>
+          <w:szCs w:val="19"/>
+        </w:rPr>
+        <w:t xml:space="preserve"> — Direction Nationale de l'Agriculture · </w:t>
+      </w:r>
+      <w:r>
+        <w:rPr>
+          <w:rFonts w:ascii="Calibri" w:cs="Calibri" w:eastAsia="Calibri" w:hAnsi="Calibri"/>
+          <w:b/>
+          <w:bCs/>
+          <w:color w:val="000000"/>
+          <w:sz w:val="19"/>
+          <w:szCs w:val="19"/>
+        </w:rPr>
+        <w:t xml:space="preserve">Ministère de l'Emploi et du Travail</w:t>
+      </w:r>
+      <w:r>
+        <w:rPr>
+          <w:rFonts w:ascii="Calibri" w:cs="Calibri" w:eastAsia="Calibri" w:hAnsi="Calibri"/>
+          <w:color w:val="000000"/>
+          <w:sz w:val="19"/>
+          <w:szCs w:val="19"/>
+        </w:rPr>
+        <w:t xml:space="preserve"> — Inspection Générale du Travail · </w:t>
+      </w:r>
+      <w:r>
+        <w:rPr>
+          <w:rFonts w:ascii="Calibri" w:cs="Calibri" w:eastAsia="Calibri" w:hAnsi="Calibri"/>
+          <w:b/>
+          <w:bCs/>
+          <w:color w:val="000000"/>
+          <w:sz w:val="19"/>
+          <w:szCs w:val="19"/>
+        </w:rPr>
+        <w:t xml:space="preserve">MESRS</w:t>
+      </w:r>
+      <w:r>
+        <w:rPr>
+          <w:rFonts w:ascii="Calibri" w:cs="Calibri" w:eastAsia="Calibri" w:hAnsi="Calibri"/>
+          <w:color w:val="000000"/>
+          <w:sz w:val="19"/>
+          <w:szCs w:val="19"/>
+        </w:rPr>
+        <w:t xml:space="preserve"> — Institut de Recherche en Environnement de Guinée · </w:t>
+      </w:r>
+      <w:r>
+        <w:rPr>
+          <w:rFonts w:ascii="Calibri" w:cs="Calibri" w:eastAsia="Calibri" w:hAnsi="Calibri"/>
+          <w:b/>
+          <w:bCs/>
+          <w:color w:val="000000"/>
+          <w:sz w:val="19"/>
+          <w:szCs w:val="19"/>
+        </w:rPr>
+        <w:t xml:space="preserve">Société civile</w:t>
+      </w:r>
+      <w:r>
+        <w:rPr>
+          <w:rFonts w:ascii="Calibri" w:cs="Calibri" w:eastAsia="Calibri" w:hAnsi="Calibri"/>
+          <w:color w:val="000000"/>
+          <w:sz w:val="19"/>
+          <w:szCs w:val="19"/>
+        </w:rPr>
+        <w:t xml:space="preserve"> — ONG Action Mines Guinée · </w:t>
+      </w:r>
+      <w:r>
+        <w:rPr>
+          <w:rFonts w:ascii="Calibri" w:cs="Calibri" w:eastAsia="Calibri" w:hAnsi="Calibri"/>
+          <w:b/>
+          <w:bCs/>
+          <w:color w:val="000000"/>
+          <w:sz w:val="19"/>
+          <w:szCs w:val="19"/>
+        </w:rPr>
+        <w:t xml:space="preserve">Promoteur</w:t>
+      </w:r>
+      <w:r>
+        <w:rPr>
+          <w:rFonts w:ascii="Calibri" w:cs="Calibri" w:eastAsia="Calibri" w:hAnsi="Calibri"/>
+          <w:color w:val="000000"/>
+          <w:sz w:val="19"/>
+          <w:szCs w:val="19"/>
+        </w:rPr>
+        <w:t xml:space="preserve"> — KAMA SA (M. Namory BAKAYOKO) · </w:t>
+      </w:r>
+      <w:r>
+        <w:rPr>
+          <w:rFonts w:ascii="Calibri" w:cs="Calibri" w:eastAsia="Calibri" w:hAnsi="Calibri"/>
+          <w:b/>
+          <w:bCs/>
+          <w:color w:val="000000"/>
+          <w:sz w:val="19"/>
+          <w:szCs w:val="19"/>
+        </w:rPr>
+        <w:t xml:space="preserve">Consultant</w:t>
+      </w:r>
+      <w:r>
+        <w:rPr>
+          <w:rFonts w:ascii="Calibri" w:cs="Calibri" w:eastAsia="Calibri" w:hAnsi="Calibri"/>
+          <w:color w:val="000000"/>
+          <w:sz w:val="19"/>
+          <w:szCs w:val="19"/>
+        </w:rPr>
+        <w:t xml:space="preserve"> — CGDEM-AEDD SARLU (Dr Mindri IDANI).</w:t>
+      </w:r>
+    </w:p>
+    <w:p>
+      <w:pPr>
+        <w:spacing w:after="0" w:before="0" w:line="230"/>
+        <w:jc w:val="both"/>
+      </w:pPr>
+      <w:r>
+        <w:rPr>
+          <w:rFonts w:ascii="Calibri" w:cs="Calibri" w:eastAsia="Calibri" w:hAnsi="Calibri"/>
+          <w:b/>
+          <w:bCs/>
+          <w:color w:val="000000"/>
+          <w:sz w:val="19"/>
+          <w:szCs w:val="19"/>
+        </w:rPr>
+        <w:t xml:space="preserve">Ordre du jour (9 points) : </w:t>
+      </w:r>
+      <w:r>
+        <w:rPr>
+          <w:rFonts w:ascii="Calibri" w:cs="Calibri" w:eastAsia="Calibri" w:hAnsi="Calibri"/>
+          <w:color w:val="000000"/>
+          <w:sz w:val="19"/>
+          <w:szCs w:val="19"/>
+        </w:rPr>
+        <w:t xml:space="preserve">installation des membres ; allocution de la représentante du DG de l'AGEE ; allocution du Président de séance ; présentation du contenu du rapport ; commentaires des membres ; réponses du Consultant et du Promoteur ; amendement et adoption du PV ; délibération ; clôture. L'exposé du consultant a porté sur le projet de Kéno, la NIES (état des lieux et impacts), le PGES et ses sous-plans, le PAR et le PRMS, le suivi et la gouvernance.</w:t>
+      </w:r>
+    </w:p>
+    <w:p>
+      <w:pPr>
+        <w:pBdr>
+          <w:bottom w:val="single" w:color="2E74B5" w:sz="8" w:space="2"/>
+        </w:pBdr>
+        <w:spacing w:after="90" w:before="200"/>
+      </w:pPr>
+      <w:r>
+        <w:rPr>
+          <w:rFonts w:ascii="Calibri" w:cs="Calibri" w:eastAsia="Calibri" w:hAnsi="Calibri"/>
+          <w:b/>
+          <w:bCs/>
+          <w:color w:val="2E74B5"/>
+          <w:sz w:val="21"/>
+          <w:szCs w:val="21"/>
+        </w:rPr>
+        <w:t xml:space="preserve">A2. </w:t>
+      </w:r>
+      <w:r>
+        <w:rPr>
+          <w:rFonts w:ascii="Calibri" w:cs="Calibri" w:eastAsia="Calibri" w:hAnsi="Calibri"/>
+          <w:b/>
+          <w:bCs/>
+          <w:color w:val="1F3864"/>
+          <w:sz w:val="21"/>
+          <w:szCs w:val="21"/>
+        </w:rPr>
+        <w:t xml:space="preserve">LES 60 RECOMMANDATIONS FORMULÉES</w:t>
+      </w:r>
+    </w:p>
+    <w:tbl>
+      <w:tblPr>
+        <w:tblW w:type="dxa" w:w="9746"/>
+        <w:tblBorders>
+          <w:top w:val="single" w:color="auto" w:sz="4"/>
+          <w:left w:val="single" w:color="auto" w:sz="4"/>
+          <w:bottom w:val="single" w:color="auto" w:sz="4"/>
+          <w:right w:val="single" w:color="auto" w:sz="4"/>
+          <w:insideH w:val="single" w:color="auto" w:sz="4"/>
+          <w:insideV w:val="single" w:color="auto" w:sz="4"/>
+        </w:tblBorders>
+      </w:tblPr>
+      <w:tblGrid>
+        <w:gridCol w:w="1300"/>
+        <w:gridCol w:w="900"/>
+        <w:gridCol w:w="7546"/>
+      </w:tblGrid>
+      <w:tr>
+        <w:trPr>
+          <w:tblHeader/>
+        </w:trPr>
+        <w:tc>
+          <w:tcPr>
+            <w:tcW w:type="dxa" w:w="1300"/>
+            <w:tcBorders>
+              <w:top w:val="single" w:color="BFBFBF" w:sz="4"/>
+              <w:left w:val="single" w:color="BFBFBF" w:sz="4"/>
+              <w:bottom w:val="single" w:color="BFBFBF" w:sz="4"/>
+              <w:right w:val="single" w:color="BFBFBF" w:sz="4"/>
+            </w:tcBorders>
+            <w:shd w:fill="1F3864" w:color="auto" w:val="clear"/>
+            <w:tcMar>
+              <w:top w:type="dxa" w:w="36"/>
+              <w:left w:type="dxa" w:w="70"/>
+              <w:bottom w:type="dxa" w:w="36"/>
+              <w:right w:type="dxa" w:w="70"/>
+            </w:tcMar>
+            <w:vAlign w:val="center"/>
+          </w:tcPr>
+          <w:p>
+            <w:pPr>
+              <w:spacing w:after="26" w:before="26" w:line="216"/>
+              <w:jc w:val="center"/>
+            </w:pPr>
+            <w:r>
+              <w:rPr>
+                <w:rFonts w:ascii="Calibri" w:cs="Calibri" w:eastAsia="Calibri" w:hAnsi="Calibri"/>
+                <w:b/>
+                <w:bCs/>
+                <w:color w:val="FFFFFF"/>
+                <w:sz w:val="17"/>
+                <w:szCs w:val="17"/>
+              </w:rPr>
+              <w:t xml:space="preserve">Volet</w:t>
+            </w:r>
+          </w:p>
+        </w:tc>
+        <w:tc>
+          <w:tcPr>
+            <w:tcW w:type="dxa" w:w="900"/>
+            <w:tcBorders>
+              <w:top w:val="single" w:color="BFBFBF" w:sz="4"/>
+              <w:left w:val="single" w:color="BFBFBF" w:sz="4"/>
+              <w:bottom w:val="single" w:color="BFBFBF" w:sz="4"/>
+              <w:right w:val="single" w:color="BFBFBF" w:sz="4"/>
+            </w:tcBorders>
+            <w:shd w:fill="1F3864" w:color="auto" w:val="clear"/>
+            <w:tcMar>
+              <w:top w:type="dxa" w:w="36"/>
+              <w:left w:type="dxa" w:w="70"/>
+              <w:bottom w:type="dxa" w:w="36"/>
+              <w:right w:type="dxa" w:w="70"/>
+            </w:tcMar>
+            <w:vAlign w:val="center"/>
+          </w:tcPr>
+          <w:p>
+            <w:pPr>
+              <w:spacing w:after="26" w:before="26" w:line="216"/>
+              <w:jc w:val="center"/>
+            </w:pPr>
+            <w:r>
+              <w:rPr>
+                <w:rFonts w:ascii="Calibri" w:cs="Calibri" w:eastAsia="Calibri" w:hAnsi="Calibri"/>
+                <w:b/>
+                <w:bCs/>
+                <w:color w:val="FFFFFF"/>
+                <w:sz w:val="17"/>
+                <w:szCs w:val="17"/>
+              </w:rPr>
+              <w:t xml:space="preserve">Nombre</w:t>
+            </w:r>
+          </w:p>
+        </w:tc>
+        <w:tc>
+          <w:tcPr>
+            <w:tcW w:type="dxa" w:w="7546"/>
+            <w:tcBorders>
+              <w:top w:val="single" w:color="BFBFBF" w:sz="4"/>
+              <w:left w:val="single" w:color="BFBFBF" w:sz="4"/>
+              <w:bottom w:val="single" w:color="BFBFBF" w:sz="4"/>
+              <w:right w:val="single" w:color="BFBFBF" w:sz="4"/>
+            </w:tcBorders>
+            <w:shd w:fill="1F3864" w:color="auto" w:val="clear"/>
+            <w:tcMar>
+              <w:top w:type="dxa" w:w="36"/>
+              <w:left w:type="dxa" w:w="70"/>
+              <w:bottom w:type="dxa" w:w="36"/>
+              <w:right w:type="dxa" w:w="70"/>
+            </w:tcMar>
+            <w:vAlign w:val="center"/>
+          </w:tcPr>
+          <w:p>
+            <w:pPr>
+              <w:spacing w:after="26" w:before="26" w:line="216"/>
+              <w:jc w:val="center"/>
+            </w:pPr>
+            <w:r>
+              <w:rPr>
+                <w:rFonts w:ascii="Calibri" w:cs="Calibri" w:eastAsia="Calibri" w:hAnsi="Calibri"/>
+                <w:b/>
+                <w:bCs/>
+                <w:color w:val="FFFFFF"/>
+                <w:sz w:val="17"/>
+                <w:szCs w:val="17"/>
+              </w:rPr>
+              <w:t xml:space="preserve">Principales demandes</w:t>
+            </w:r>
+          </w:p>
+        </w:tc>
+      </w:tr>
+      <w:tr>
+        <w:trPr>
+          <w:tblHeader w:val="false"/>
+        </w:trPr>
+        <w:tc>
+          <w:tcPr>
+            <w:tcW w:type="dxa" w:w="1300"/>
+            <w:tcBorders>
+              <w:top w:val="single" w:color="BFBFBF" w:sz="4"/>
+              <w:left w:val="single" w:color="BFBFBF" w:sz="4"/>
+              <w:bottom w:val="single" w:color="BFBFBF" w:sz="4"/>
+              <w:right w:val="single" w:color="BFBFBF" w:sz="4"/>
+            </w:tcBorders>
+            <w:tcMar>
+              <w:top w:type="dxa" w:w="36"/>
+              <w:left w:type="dxa" w:w="70"/>
+              <w:bottom w:type="dxa" w:w="36"/>
+              <w:right w:type="dxa" w:w="70"/>
+            </w:tcMar>
+            <w:vAlign w:val="center"/>
+          </w:tcPr>
+          <w:p>
+            <w:pPr>
+              <w:spacing w:after="26" w:before="26" w:line="216"/>
+            </w:pPr>
+            <w:r>
+              <w:rPr>
+                <w:rFonts w:ascii="Calibri" w:cs="Calibri" w:eastAsia="Calibri" w:hAnsi="Calibri"/>
+                <w:b/>
+                <w:bCs/>
+                <w:color w:val="000000"/>
+                <w:sz w:val="17"/>
+                <w:szCs w:val="17"/>
+              </w:rPr>
+              <w:t xml:space="preserve">NIES — forme</w:t>
+            </w:r>
+          </w:p>
+        </w:tc>
+        <w:tc>
+          <w:tcPr>
+            <w:tcW w:type="dxa" w:w="900"/>
+            <w:tcBorders>
+              <w:top w:val="single" w:color="BFBFBF" w:sz="4"/>
+              <w:left w:val="single" w:color="BFBFBF" w:sz="4"/>
+              <w:bottom w:val="single" w:color="BFBFBF" w:sz="4"/>
+              <w:right w:val="single" w:color="BFBFBF" w:sz="4"/>
+            </w:tcBorders>
+            <w:tcMar>
+              <w:top w:type="dxa" w:w="36"/>
+              <w:left w:type="dxa" w:w="70"/>
+              <w:bottom w:type="dxa" w:w="36"/>
+              <w:right w:type="dxa" w:w="70"/>
+            </w:tcMar>
+            <w:vAlign w:val="center"/>
+          </w:tcPr>
+          <w:p>
+            <w:pPr>
+              <w:spacing w:after="26" w:before="26" w:line="216"/>
+              <w:jc w:val="center"/>
+            </w:pPr>
+            <w:r>
+              <w:rPr>
+                <w:rFonts w:ascii="Calibri" w:cs="Calibri" w:eastAsia="Calibri" w:hAnsi="Calibri"/>
+                <w:b/>
+                <w:bCs/>
+                <w:color w:val="000000"/>
+                <w:sz w:val="17"/>
+                <w:szCs w:val="17"/>
+              </w:rPr>
+              <w:t xml:space="preserve">10</w:t>
+            </w:r>
+          </w:p>
+        </w:tc>
+        <w:tc>
+          <w:tcPr>
+            <w:tcW w:type="dxa" w:w="7546"/>
+            <w:tcBorders>
+              <w:top w:val="single" w:color="BFBFBF" w:sz="4"/>
+              <w:left w:val="single" w:color="BFBFBF" w:sz="4"/>
+              <w:bottom w:val="single" w:color="BFBFBF" w:sz="4"/>
+              <w:right w:val="single" w:color="BFBFBF" w:sz="4"/>
+            </w:tcBorders>
+            <w:tcMar>
+              <w:top w:type="dxa" w:w="36"/>
+              <w:left w:type="dxa" w:w="70"/>
+              <w:bottom w:type="dxa" w:w="36"/>
+              <w:right w:type="dxa" w:w="70"/>
+            </w:tcMar>
+            <w:vAlign w:val="center"/>
+          </w:tcPr>
+          <w:p>
+            <w:pPr>
+              <w:spacing w:after="26" w:before="26" w:line="216"/>
+            </w:pPr>
+            <w:r>
+              <w:rPr>
+                <w:rFonts w:ascii="Calibri" w:cs="Calibri" w:eastAsia="Calibri" w:hAnsi="Calibri"/>
+                <w:color w:val="000000"/>
+                <w:sz w:val="17"/>
+                <w:szCs w:val="17"/>
+              </w:rPr>
+              <w:t xml:space="preserve">Armoirie de la République en page de garde ; restructuration du rapport conformément à l'article 25 de l'Arrêté 1595 ; correction des coquilles (p. 118-129) ; annexer la liste des participants, les PV de consultations publiques et les TdR ; harmonisation des sigles et légendes ; ordonnancement juridique (p. 43) ; numérotation et puces (p. 24-29).</w:t>
+            </w:r>
+          </w:p>
+        </w:tc>
+      </w:tr>
+      <w:tr>
+        <w:trPr>
+          <w:tblHeader w:val="false"/>
+        </w:trPr>
+        <w:tc>
+          <w:tcPr>
+            <w:tcW w:type="dxa" w:w="1300"/>
+            <w:tcBorders>
+              <w:top w:val="single" w:color="BFBFBF" w:sz="4"/>
+              <w:left w:val="single" w:color="BFBFBF" w:sz="4"/>
+              <w:bottom w:val="single" w:color="BFBFBF" w:sz="4"/>
+              <w:right w:val="single" w:color="BFBFBF" w:sz="4"/>
+            </w:tcBorders>
+            <w:shd w:fill="F4F8FC" w:color="auto" w:val="clear"/>
+            <w:tcMar>
+              <w:top w:type="dxa" w:w="36"/>
+              <w:left w:type="dxa" w:w="70"/>
+              <w:bottom w:type="dxa" w:w="36"/>
+              <w:right w:type="dxa" w:w="70"/>
+            </w:tcMar>
+            <w:vAlign w:val="center"/>
+          </w:tcPr>
+          <w:p>
+            <w:pPr>
+              <w:spacing w:after="26" w:before="26" w:line="216"/>
+            </w:pPr>
+            <w:r>
+              <w:rPr>
+                <w:rFonts w:ascii="Calibri" w:cs="Calibri" w:eastAsia="Calibri" w:hAnsi="Calibri"/>
+                <w:b/>
+                <w:bCs/>
+                <w:color w:val="000000"/>
+                <w:sz w:val="17"/>
+                <w:szCs w:val="17"/>
+              </w:rPr>
+              <w:t xml:space="preserve">NIES — fond</w:t>
+            </w:r>
+          </w:p>
+        </w:tc>
+        <w:tc>
+          <w:tcPr>
+            <w:tcW w:type="dxa" w:w="900"/>
+            <w:tcBorders>
+              <w:top w:val="single" w:color="BFBFBF" w:sz="4"/>
+              <w:left w:val="single" w:color="BFBFBF" w:sz="4"/>
+              <w:bottom w:val="single" w:color="BFBFBF" w:sz="4"/>
+              <w:right w:val="single" w:color="BFBFBF" w:sz="4"/>
+            </w:tcBorders>
+            <w:shd w:fill="F4F8FC" w:color="auto" w:val="clear"/>
+            <w:tcMar>
+              <w:top w:type="dxa" w:w="36"/>
+              <w:left w:type="dxa" w:w="70"/>
+              <w:bottom w:type="dxa" w:w="36"/>
+              <w:right w:type="dxa" w:w="70"/>
+            </w:tcMar>
+            <w:vAlign w:val="center"/>
+          </w:tcPr>
+          <w:p>
+            <w:pPr>
+              <w:spacing w:after="26" w:before="26" w:line="216"/>
+              <w:jc w:val="center"/>
+            </w:pPr>
+            <w:r>
+              <w:rPr>
+                <w:rFonts w:ascii="Calibri" w:cs="Calibri" w:eastAsia="Calibri" w:hAnsi="Calibri"/>
+                <w:b/>
+                <w:bCs/>
+                <w:color w:val="000000"/>
+                <w:sz w:val="17"/>
+                <w:szCs w:val="17"/>
+              </w:rPr>
+              <w:t xml:space="preserve">42</w:t>
+            </w:r>
+          </w:p>
+        </w:tc>
+        <w:tc>
+          <w:tcPr>
+            <w:tcW w:type="dxa" w:w="7546"/>
+            <w:tcBorders>
+              <w:top w:val="single" w:color="BFBFBF" w:sz="4"/>
+              <w:left w:val="single" w:color="BFBFBF" w:sz="4"/>
+              <w:bottom w:val="single" w:color="BFBFBF" w:sz="4"/>
+              <w:right w:val="single" w:color="BFBFBF" w:sz="4"/>
+            </w:tcBorders>
+            <w:tcMar>
+              <w:top w:type="dxa" w:w="36"/>
+              <w:left w:type="dxa" w:w="70"/>
+              <w:bottom w:type="dxa" w:w="36"/>
+              <w:right w:type="dxa" w:w="70"/>
+            </w:tcMar>
+            <w:vAlign w:val="center"/>
+          </w:tcPr>
+          <w:p>
+            <w:pPr>
+              <w:spacing w:after="26" w:before="26" w:line="216"/>
+            </w:pPr>
+            <w:r>
+              <w:rPr>
+                <w:rFonts w:ascii="Calibri" w:cs="Calibri" w:eastAsia="Calibri" w:hAnsi="Calibri"/>
+                <w:color w:val="000000"/>
+                <w:sz w:val="17"/>
+                <w:szCs w:val="17"/>
+              </w:rPr>
+              <w:t xml:space="preserve">Chapitre méthodologique dédié ; amélioration du résumé non technique ; analyse des variantes selon la hiérarchie d'atténuation et justification du scénario « sans projet » ; conversion du coût du PGES en GNF et harmonisation (p. 150 et s.) ; actualisation du cadre juridique (Arrêtés 1595 et 4114, Accord de Paris, Simandou 2040, code de l'eau, collectivités locales, loi d'orientation agricole, retrait de la NP7 SFI) et institutionnel (MATD, MAHH, DNH, DG Météorologie) ; dispositif de suivi de la stabilité des ouvrages (p. 24-27) ; surveillance des pollutions liées à l'orpaillage (p. 74-75) et impacts cumulatifs (p. 116) ; actualisation démographique au RGPH-4 ; refonte de l'évaluation des impacts avec dissociation impacts initiaux / résiduels (p. 107-117) ; noms scientifiques des espèces (p. 115) ; chaîne de gestion des déchets (p. 131-133) ; recalcul des émissions de GES et compensation des zones de séquestration (p. 132-138) ; harmonisation de la durée de vie du projet ; grille de compensation validée ; scénarios climatiques et mesures d'adaptation ; services écosystémiques ; campagnes couvrant au minimum deux saisons ; indicateurs écologiques et cartographie des habitats sensibles ; étude spécifique d'écologie aquatique ; impacts sur les habitats naturels et espèces à statut ; mesures concrètes sur les impacts transfrontaliers ; analyse des alternatives de transport de la production (p. 60).</w:t>
+            </w:r>
+          </w:p>
+        </w:tc>
+      </w:tr>
+      <w:tr>
+        <w:trPr>
+          <w:tblHeader w:val="false"/>
+        </w:trPr>
+        <w:tc>
+          <w:tcPr>
+            <w:tcW w:type="dxa" w:w="1300"/>
+            <w:tcBorders>
+              <w:top w:val="single" w:color="BFBFBF" w:sz="4"/>
+              <w:left w:val="single" w:color="BFBFBF" w:sz="4"/>
+              <w:bottom w:val="single" w:color="BFBFBF" w:sz="4"/>
+              <w:right w:val="single" w:color="BFBFBF" w:sz="4"/>
+            </w:tcBorders>
+            <w:tcMar>
+              <w:top w:type="dxa" w:w="36"/>
+              <w:left w:type="dxa" w:w="70"/>
+              <w:bottom w:type="dxa" w:w="36"/>
+              <w:right w:type="dxa" w:w="70"/>
+            </w:tcMar>
+            <w:vAlign w:val="center"/>
+          </w:tcPr>
+          <w:p>
+            <w:pPr>
+              <w:spacing w:after="26" w:before="26" w:line="216"/>
+            </w:pPr>
+            <w:r>
+              <w:rPr>
+                <w:rFonts w:ascii="Calibri" w:cs="Calibri" w:eastAsia="Calibri" w:hAnsi="Calibri"/>
+                <w:b/>
+                <w:bCs/>
+                <w:color w:val="000000"/>
+                <w:sz w:val="17"/>
+                <w:szCs w:val="17"/>
+              </w:rPr>
+              <w:t xml:space="preserve">PARC — forme</w:t>
+            </w:r>
+          </w:p>
+        </w:tc>
+        <w:tc>
+          <w:tcPr>
+            <w:tcW w:type="dxa" w:w="900"/>
+            <w:tcBorders>
+              <w:top w:val="single" w:color="BFBFBF" w:sz="4"/>
+              <w:left w:val="single" w:color="BFBFBF" w:sz="4"/>
+              <w:bottom w:val="single" w:color="BFBFBF" w:sz="4"/>
+              <w:right w:val="single" w:color="BFBFBF" w:sz="4"/>
+            </w:tcBorders>
+            <w:tcMar>
+              <w:top w:type="dxa" w:w="36"/>
+              <w:left w:type="dxa" w:w="70"/>
+              <w:bottom w:type="dxa" w:w="36"/>
+              <w:right w:type="dxa" w:w="70"/>
+            </w:tcMar>
+            <w:vAlign w:val="center"/>
+          </w:tcPr>
+          <w:p>
+            <w:pPr>
+              <w:spacing w:after="26" w:before="26" w:line="216"/>
+              <w:jc w:val="center"/>
+            </w:pPr>
+            <w:r>
+              <w:rPr>
+                <w:rFonts w:ascii="Calibri" w:cs="Calibri" w:eastAsia="Calibri" w:hAnsi="Calibri"/>
+                <w:b/>
+                <w:bCs/>
+                <w:color w:val="000000"/>
+                <w:sz w:val="17"/>
+                <w:szCs w:val="17"/>
+              </w:rPr>
+              <w:t xml:space="preserve">4</w:t>
+            </w:r>
+          </w:p>
+        </w:tc>
+        <w:tc>
+          <w:tcPr>
+            <w:tcW w:type="dxa" w:w="7546"/>
+            <w:tcBorders>
+              <w:top w:val="single" w:color="BFBFBF" w:sz="4"/>
+              <w:left w:val="single" w:color="BFBFBF" w:sz="4"/>
+              <w:bottom w:val="single" w:color="BFBFBF" w:sz="4"/>
+              <w:right w:val="single" w:color="BFBFBF" w:sz="4"/>
+            </w:tcBorders>
+            <w:tcMar>
+              <w:top w:type="dxa" w:w="36"/>
+              <w:left w:type="dxa" w:w="70"/>
+              <w:bottom w:type="dxa" w:w="36"/>
+              <w:right w:type="dxa" w:w="70"/>
+            </w:tcMar>
+            <w:vAlign w:val="center"/>
+          </w:tcPr>
+          <w:p>
+            <w:pPr>
+              <w:spacing w:after="26" w:before="26" w:line="216"/>
+            </w:pPr>
+            <w:r>
+              <w:rPr>
+                <w:rFonts w:ascii="Calibri" w:cs="Calibri" w:eastAsia="Calibri" w:hAnsi="Calibri"/>
+                <w:color w:val="000000"/>
+                <w:sz w:val="17"/>
+                <w:szCs w:val="17"/>
+              </w:rPr>
+              <w:t xml:space="preserve">Logo du Ministère de l'Énergie en page de garde ; tableau nominatif des PAP ; modèles de PV et formulaires signés avec traduction orale documentée pour les 54 % de personnes analphabètes ; fiches de PV de négociation individuelle, PV de consultation et de réunion, listes de participants.</w:t>
+            </w:r>
+          </w:p>
+        </w:tc>
+      </w:tr>
+      <w:tr>
+        <w:trPr>
+          <w:tblHeader w:val="false"/>
+        </w:trPr>
+        <w:tc>
+          <w:tcPr>
+            <w:tcW w:type="dxa" w:w="1300"/>
+            <w:tcBorders>
+              <w:top w:val="single" w:color="BFBFBF" w:sz="4"/>
+              <w:left w:val="single" w:color="BFBFBF" w:sz="4"/>
+              <w:bottom w:val="single" w:color="BFBFBF" w:sz="4"/>
+              <w:right w:val="single" w:color="BFBFBF" w:sz="4"/>
+            </w:tcBorders>
+            <w:shd w:fill="F4F8FC" w:color="auto" w:val="clear"/>
+            <w:tcMar>
+              <w:top w:type="dxa" w:w="36"/>
+              <w:left w:type="dxa" w:w="70"/>
+              <w:bottom w:type="dxa" w:w="36"/>
+              <w:right w:type="dxa" w:w="70"/>
+            </w:tcMar>
+            <w:vAlign w:val="center"/>
+          </w:tcPr>
+          <w:p>
+            <w:pPr>
+              <w:spacing w:after="26" w:before="26" w:line="216"/>
+            </w:pPr>
+            <w:r>
+              <w:rPr>
+                <w:rFonts w:ascii="Calibri" w:cs="Calibri" w:eastAsia="Calibri" w:hAnsi="Calibri"/>
+                <w:b/>
+                <w:bCs/>
+                <w:color w:val="000000"/>
+                <w:sz w:val="17"/>
+                <w:szCs w:val="17"/>
+              </w:rPr>
+              <w:t xml:space="preserve">PARC — fond</w:t>
+            </w:r>
+          </w:p>
+        </w:tc>
+        <w:tc>
+          <w:tcPr>
+            <w:tcW w:type="dxa" w:w="900"/>
+            <w:tcBorders>
+              <w:top w:val="single" w:color="BFBFBF" w:sz="4"/>
+              <w:left w:val="single" w:color="BFBFBF" w:sz="4"/>
+              <w:bottom w:val="single" w:color="BFBFBF" w:sz="4"/>
+              <w:right w:val="single" w:color="BFBFBF" w:sz="4"/>
+            </w:tcBorders>
+            <w:shd w:fill="F4F8FC" w:color="auto" w:val="clear"/>
+            <w:tcMar>
+              <w:top w:type="dxa" w:w="36"/>
+              <w:left w:type="dxa" w:w="70"/>
+              <w:bottom w:type="dxa" w:w="36"/>
+              <w:right w:type="dxa" w:w="70"/>
+            </w:tcMar>
+            <w:vAlign w:val="center"/>
+          </w:tcPr>
+          <w:p>
+            <w:pPr>
+              <w:spacing w:after="26" w:before="26" w:line="216"/>
+              <w:jc w:val="center"/>
+            </w:pPr>
+            <w:r>
+              <w:rPr>
+                <w:rFonts w:ascii="Calibri" w:cs="Calibri" w:eastAsia="Calibri" w:hAnsi="Calibri"/>
+                <w:b/>
+                <w:bCs/>
+                <w:color w:val="000000"/>
+                <w:sz w:val="17"/>
+                <w:szCs w:val="17"/>
+              </w:rPr>
+              <w:t xml:space="preserve">4</w:t>
+            </w:r>
+          </w:p>
+        </w:tc>
+        <w:tc>
+          <w:tcPr>
+            <w:tcW w:type="dxa" w:w="7546"/>
+            <w:tcBorders>
+              <w:top w:val="single" w:color="BFBFBF" w:sz="4"/>
+              <w:left w:val="single" w:color="BFBFBF" w:sz="4"/>
+              <w:bottom w:val="single" w:color="BFBFBF" w:sz="4"/>
+              <w:right w:val="single" w:color="BFBFBF" w:sz="4"/>
+            </w:tcBorders>
+            <w:tcMar>
+              <w:top w:type="dxa" w:w="36"/>
+              <w:left w:type="dxa" w:w="70"/>
+              <w:bottom w:type="dxa" w:w="36"/>
+              <w:right w:type="dxa" w:w="70"/>
+            </w:tcMar>
+            <w:vAlign w:val="center"/>
+          </w:tcPr>
+          <w:p>
+            <w:pPr>
+              <w:spacing w:after="26" w:before="26" w:line="216"/>
+            </w:pPr>
+            <w:r>
+              <w:rPr>
+                <w:rFonts w:ascii="Calibri" w:cs="Calibri" w:eastAsia="Calibri" w:hAnsi="Calibri"/>
+                <w:color w:val="000000"/>
+                <w:sz w:val="17"/>
+                <w:szCs w:val="17"/>
+              </w:rPr>
+              <w:t xml:space="preserve">Fiches filières détaillées (intrants, rendements attendus, marchés, accompagnement technique) adaptées au profil des PAP ; actualisation du cadre institutionnel avec la Direction Préfectorale de l'Agriculture et de l'Élevage (p. 7) ; harmonisation de la surface de cultures vivrières (p. 39 et s.) ; harmonisation des périodes de consultations publiques (p. 65 et s.).</w:t>
+            </w:r>
+          </w:p>
+        </w:tc>
+      </w:tr>
+    </w:tbl>
+    <w:p>
+      <w:pPr>
+        <w:pBdr>
+          <w:bottom w:val="single" w:color="2E74B5" w:sz="8" w:space="2"/>
+        </w:pBdr>
+        <w:spacing w:after="90" w:before="200"/>
+      </w:pPr>
+      <w:r>
+        <w:rPr>
+          <w:rFonts w:ascii="Calibri" w:cs="Calibri" w:eastAsia="Calibri" w:hAnsi="Calibri"/>
+          <w:b/>
+          <w:bCs/>
+          <w:color w:val="2E74B5"/>
+          <w:sz w:val="21"/>
+          <w:szCs w:val="21"/>
+        </w:rPr>
+        <w:t xml:space="preserve">A3. </w:t>
+      </w:r>
+      <w:r>
+        <w:rPr>
+          <w:rFonts w:ascii="Calibri" w:cs="Calibri" w:eastAsia="Calibri" w:hAnsi="Calibri"/>
+          <w:b/>
+          <w:bCs/>
+          <w:color w:val="1F3864"/>
+          <w:sz w:val="21"/>
+          <w:szCs w:val="21"/>
+        </w:rPr>
+        <w:t xml:space="preserve">CONCLUSION DU PROCÈS-VERBAL</w:t>
+      </w:r>
+    </w:p>
+    <w:p>
+      <w:pPr>
+        <w:pStyle w:val="ListParagraph"/>
+        <w:numPr>
+          <w:ilvl w:val="0"/>
+          <w:numId w:val="2"/>
+        </w:numPr>
+        <w:spacing w:after="40" w:line="228"/>
+      </w:pPr>
+      <w:r>
+        <w:rPr>
+          <w:rFonts w:ascii="Calibri" w:cs="Calibri" w:eastAsia="Calibri" w:hAnsi="Calibri"/>
+          <w:color w:val="000000"/>
+          <w:sz w:val="18"/>
+          <w:szCs w:val="18"/>
+        </w:rPr>
+        <w:t xml:space="preserve">Après examen et analyse, le rapport est jugé </w:t>
+      </w:r>
+      <w:r>
+        <w:rPr>
+          <w:rFonts w:ascii="Calibri" w:cs="Calibri" w:eastAsia="Calibri" w:hAnsi="Calibri"/>
+          <w:b/>
+          <w:bCs/>
+          <w:color w:val="1E6B3A"/>
+          <w:sz w:val="18"/>
+          <w:szCs w:val="18"/>
+        </w:rPr>
+        <w:t xml:space="preserve">recevable</w:t>
+      </w:r>
+      <w:r>
+        <w:rPr>
+          <w:rFonts w:ascii="Calibri" w:cs="Calibri" w:eastAsia="Calibri" w:hAnsi="Calibri"/>
+          <w:color w:val="000000"/>
+          <w:sz w:val="18"/>
+          <w:szCs w:val="18"/>
+        </w:rPr>
+        <w:t xml:space="preserve">.</w:t>
+      </w:r>
+    </w:p>
+    <w:p>
+      <w:pPr>
+        <w:pStyle w:val="ListParagraph"/>
+        <w:numPr>
+          <w:ilvl w:val="0"/>
+          <w:numId w:val="2"/>
+        </w:numPr>
+        <w:spacing w:after="40" w:line="228"/>
+      </w:pPr>
+      <w:r>
+        <w:rPr>
+          <w:rFonts w:ascii="Calibri" w:cs="Calibri" w:eastAsia="Calibri" w:hAnsi="Calibri"/>
+          <w:color w:val="000000"/>
+          <w:sz w:val="18"/>
+          <w:szCs w:val="18"/>
+        </w:rPr>
+        <w:t xml:space="preserve">La délivrance de l'Autorisation Environnementale </w:t>
+      </w:r>
+      <w:r>
+        <w:rPr>
+          <w:rFonts w:ascii="Calibri" w:cs="Calibri" w:eastAsia="Calibri" w:hAnsi="Calibri"/>
+          <w:b/>
+          <w:bCs/>
+          <w:color w:val="000000"/>
+          <w:sz w:val="18"/>
+          <w:szCs w:val="18"/>
+        </w:rPr>
+        <w:t xml:space="preserve">dépend de la prise en compte effective</w:t>
+      </w:r>
+      <w:r>
+        <w:rPr>
+          <w:rFonts w:ascii="Calibri" w:cs="Calibri" w:eastAsia="Calibri" w:hAnsi="Calibri"/>
+          <w:color w:val="000000"/>
+          <w:sz w:val="18"/>
+          <w:szCs w:val="18"/>
+        </w:rPr>
+        <w:t xml:space="preserve"> des recommandations, lesquelles sont jointes au PV et en font partie intégrante.</w:t>
+      </w:r>
+    </w:p>
+    <w:p>
+      <w:pPr>
+        <w:pStyle w:val="ListParagraph"/>
+        <w:numPr>
+          <w:ilvl w:val="0"/>
+          <w:numId w:val="2"/>
+        </w:numPr>
+        <w:spacing w:after="40" w:line="228"/>
+      </w:pPr>
+      <w:r>
+        <w:rPr>
+          <w:rFonts w:ascii="Calibri" w:cs="Calibri" w:eastAsia="Calibri" w:hAnsi="Calibri"/>
+          <w:color w:val="000000"/>
+          <w:sz w:val="18"/>
+          <w:szCs w:val="18"/>
+        </w:rPr>
+        <w:t xml:space="preserve">La version finale du rapport doit être accompagnée d'une </w:t>
+      </w:r>
+      <w:r>
+        <w:rPr>
+          <w:rFonts w:ascii="Calibri" w:cs="Calibri" w:eastAsia="Calibri" w:hAnsi="Calibri"/>
+          <w:b/>
+          <w:bCs/>
+          <w:color w:val="000000"/>
+          <w:sz w:val="18"/>
+          <w:szCs w:val="18"/>
+        </w:rPr>
+        <w:t xml:space="preserve">fiche attestant l'intégration</w:t>
+      </w:r>
+      <w:r>
+        <w:rPr>
+          <w:rFonts w:ascii="Calibri" w:cs="Calibri" w:eastAsia="Calibri" w:hAnsi="Calibri"/>
+          <w:color w:val="000000"/>
+          <w:sz w:val="18"/>
+          <w:szCs w:val="18"/>
+        </w:rPr>
+        <w:t xml:space="preserve"> de ces recommandations.</w:t>
+      </w:r>
+    </w:p>
+    <w:p>
+      <w:pPr>
+        <w:pStyle w:val="ListParagraph"/>
+        <w:numPr>
+          <w:ilvl w:val="0"/>
+          <w:numId w:val="2"/>
+        </w:numPr>
+        <w:spacing w:after="40" w:line="228"/>
+      </w:pPr>
+      <w:r>
+        <w:rPr>
+          <w:rFonts w:ascii="Calibri" w:cs="Calibri" w:eastAsia="Calibri" w:hAnsi="Calibri"/>
+          <w:color w:val="000000"/>
+          <w:sz w:val="18"/>
+          <w:szCs w:val="18"/>
+        </w:rPr>
+        <w:t xml:space="preserve">Un </w:t>
+      </w:r>
+      <w:r>
+        <w:rPr>
+          <w:rFonts w:ascii="Calibri" w:cs="Calibri" w:eastAsia="Calibri" w:hAnsi="Calibri"/>
+          <w:b/>
+          <w:bCs/>
+          <w:color w:val="000000"/>
+          <w:sz w:val="18"/>
+          <w:szCs w:val="18"/>
+        </w:rPr>
+        <w:t xml:space="preserve">comité restreint du CTAE, sous la coordination de l'AGEE</w:t>
+      </w:r>
+      <w:r>
+        <w:rPr>
+          <w:rFonts w:ascii="Calibri" w:cs="Calibri" w:eastAsia="Calibri" w:hAnsi="Calibri"/>
+          <w:color w:val="000000"/>
+          <w:sz w:val="18"/>
+          <w:szCs w:val="18"/>
+        </w:rPr>
+        <w:t xml:space="preserve">, sera mis en place pour vérifier la conformité du document, à la charge du Promoteur.</w:t>
+      </w:r>
+    </w:p>
+    <w:p>
+      <w:pPr>
+        <w:pBdr>
+          <w:bottom w:val="single" w:color="2E74B5" w:sz="8" w:space="2"/>
+        </w:pBdr>
+        <w:spacing w:after="90" w:before="200"/>
+      </w:pPr>
+      <w:r>
+        <w:rPr>
+          <w:rFonts w:ascii="Calibri" w:cs="Calibri" w:eastAsia="Calibri" w:hAnsi="Calibri"/>
+          <w:b/>
+          <w:bCs/>
+          <w:color w:val="2E74B5"/>
+          <w:sz w:val="21"/>
+          <w:szCs w:val="21"/>
+        </w:rPr>
+        <w:t xml:space="preserve">A4. </w:t>
+      </w:r>
+      <w:r>
+        <w:rPr>
+          <w:rFonts w:ascii="Calibri" w:cs="Calibri" w:eastAsia="Calibri" w:hAnsi="Calibri"/>
+          <w:b/>
+          <w:bCs/>
+          <w:color w:val="1F3864"/>
+          <w:sz w:val="21"/>
+          <w:szCs w:val="21"/>
+        </w:rPr>
+        <w:t xml:space="preserve">SIGNATAIRES DU PROCÈS-VERBAL</w:t>
+      </w:r>
+    </w:p>
+    <w:tbl>
+      <w:tblPr>
+        <w:tblW w:type="dxa" w:w="9746"/>
+        <w:tblBorders>
+          <w:top w:val="single" w:color="auto" w:sz="4"/>
+          <w:left w:val="single" w:color="auto" w:sz="4"/>
+          <w:bottom w:val="single" w:color="auto" w:sz="4"/>
+          <w:right w:val="single" w:color="auto" w:sz="4"/>
+          <w:insideH w:val="single" w:color="auto" w:sz="4"/>
+          <w:insideV w:val="single" w:color="auto" w:sz="4"/>
+        </w:tblBorders>
+      </w:tblPr>
+      <w:tblGrid>
+        <w:gridCol w:w="2436"/>
+        <w:gridCol w:w="2436"/>
+        <w:gridCol w:w="2437"/>
+        <w:gridCol w:w="2437"/>
+      </w:tblGrid>
+      <w:tr>
+        <w:trPr>
+          <w:tblHeader/>
+        </w:trPr>
+        <w:tc>
+          <w:tcPr>
+            <w:tcW w:type="dxa" w:w="2436"/>
+            <w:tcBorders>
+              <w:top w:val="single" w:color="BFBFBF" w:sz="4"/>
+              <w:left w:val="single" w:color="BFBFBF" w:sz="4"/>
+              <w:bottom w:val="single" w:color="BFBFBF" w:sz="4"/>
+              <w:right w:val="single" w:color="BFBFBF" w:sz="4"/>
+            </w:tcBorders>
+            <w:shd w:fill="DEEAF6" w:color="auto" w:val="clear"/>
+            <w:tcMar>
+              <w:top w:type="dxa" w:w="36"/>
+              <w:left w:type="dxa" w:w="70"/>
+              <w:bottom w:type="dxa" w:w="36"/>
+              <w:right w:type="dxa" w:w="70"/>
+            </w:tcMar>
+            <w:vAlign w:val="center"/>
+          </w:tcPr>
+          <w:p>
+            <w:pPr>
+              <w:spacing w:after="26" w:before="26" w:line="216"/>
+              <w:jc w:val="center"/>
+            </w:pPr>
+            <w:r>
+              <w:rPr>
+                <w:rFonts w:ascii="Calibri" w:cs="Calibri" w:eastAsia="Calibri" w:hAnsi="Calibri"/>
+                <w:b/>
+                <w:bCs/>
+                <w:color w:val="000000"/>
+                <w:sz w:val="17"/>
+                <w:szCs w:val="17"/>
+              </w:rPr>
+              <w:t xml:space="preserve">Président</w:t>
+            </w:r>
+          </w:p>
+        </w:tc>
+        <w:tc>
+          <w:tcPr>
+            <w:tcW w:type="dxa" w:w="2436"/>
+            <w:tcBorders>
+              <w:top w:val="single" w:color="BFBFBF" w:sz="4"/>
+              <w:left w:val="single" w:color="BFBFBF" w:sz="4"/>
+              <w:bottom w:val="single" w:color="BFBFBF" w:sz="4"/>
+              <w:right w:val="single" w:color="BFBFBF" w:sz="4"/>
+            </w:tcBorders>
+            <w:shd w:fill="DEEAF6" w:color="auto" w:val="clear"/>
+            <w:tcMar>
+              <w:top w:type="dxa" w:w="36"/>
+              <w:left w:type="dxa" w:w="70"/>
+              <w:bottom w:type="dxa" w:w="36"/>
+              <w:right w:type="dxa" w:w="70"/>
+            </w:tcMar>
+            <w:vAlign w:val="center"/>
+          </w:tcPr>
+          <w:p>
+            <w:pPr>
+              <w:spacing w:after="26" w:before="26" w:line="216"/>
+              <w:jc w:val="center"/>
+            </w:pPr>
+            <w:r>
+              <w:rPr>
+                <w:rFonts w:ascii="Calibri" w:cs="Calibri" w:eastAsia="Calibri" w:hAnsi="Calibri"/>
+                <w:b/>
+                <w:bCs/>
+                <w:color w:val="000000"/>
+                <w:sz w:val="17"/>
+                <w:szCs w:val="17"/>
+              </w:rPr>
+              <w:t xml:space="preserve">1er Assesseur</w:t>
+            </w:r>
+          </w:p>
+        </w:tc>
+        <w:tc>
+          <w:tcPr>
+            <w:tcW w:type="dxa" w:w="2437"/>
+            <w:tcBorders>
+              <w:top w:val="single" w:color="BFBFBF" w:sz="4"/>
+              <w:left w:val="single" w:color="BFBFBF" w:sz="4"/>
+              <w:bottom w:val="single" w:color="BFBFBF" w:sz="4"/>
+              <w:right w:val="single" w:color="BFBFBF" w:sz="4"/>
+            </w:tcBorders>
+            <w:shd w:fill="DEEAF6" w:color="auto" w:val="clear"/>
+            <w:tcMar>
+              <w:top w:type="dxa" w:w="36"/>
+              <w:left w:type="dxa" w:w="70"/>
+              <w:bottom w:type="dxa" w:w="36"/>
+              <w:right w:type="dxa" w:w="70"/>
+            </w:tcMar>
+            <w:vAlign w:val="center"/>
+          </w:tcPr>
+          <w:p>
+            <w:pPr>
+              <w:spacing w:after="26" w:before="26" w:line="216"/>
+              <w:jc w:val="center"/>
+            </w:pPr>
+            <w:r>
+              <w:rPr>
+                <w:rFonts w:ascii="Calibri" w:cs="Calibri" w:eastAsia="Calibri" w:hAnsi="Calibri"/>
+                <w:b/>
+                <w:bCs/>
+                <w:color w:val="000000"/>
+                <w:sz w:val="17"/>
+                <w:szCs w:val="17"/>
+              </w:rPr>
+              <w:t xml:space="preserve">2e Assesseur</w:t>
+            </w:r>
+          </w:p>
+        </w:tc>
+        <w:tc>
+          <w:tcPr>
+            <w:tcW w:type="dxa" w:w="2437"/>
+            <w:tcBorders>
+              <w:top w:val="single" w:color="BFBFBF" w:sz="4"/>
+              <w:left w:val="single" w:color="BFBFBF" w:sz="4"/>
+              <w:bottom w:val="single" w:color="BFBFBF" w:sz="4"/>
+              <w:right w:val="single" w:color="BFBFBF" w:sz="4"/>
+            </w:tcBorders>
+            <w:shd w:fill="DEEAF6" w:color="auto" w:val="clear"/>
+            <w:tcMar>
+              <w:top w:type="dxa" w:w="36"/>
+              <w:left w:type="dxa" w:w="70"/>
+              <w:bottom w:type="dxa" w:w="36"/>
+              <w:right w:type="dxa" w:w="70"/>
+            </w:tcMar>
+            <w:vAlign w:val="center"/>
+          </w:tcPr>
+          <w:p>
+            <w:pPr>
+              <w:spacing w:after="26" w:before="26" w:line="216"/>
+              <w:jc w:val="center"/>
+            </w:pPr>
+            <w:r>
+              <w:rPr>
+                <w:rFonts w:ascii="Calibri" w:cs="Calibri" w:eastAsia="Calibri" w:hAnsi="Calibri"/>
+                <w:b/>
+                <w:bCs/>
+                <w:color w:val="000000"/>
+                <w:sz w:val="17"/>
+                <w:szCs w:val="17"/>
+              </w:rPr>
+              <w:t xml:space="preserve">Rapporteur</w:t>
+            </w:r>
+          </w:p>
+        </w:tc>
+      </w:tr>
+      <w:tr>
+        <w:trPr>
+          <w:tblHeader w:val="false"/>
+        </w:trPr>
+        <w:tc>
+          <w:tcPr>
+            <w:tcW w:type="dxa" w:w="2436"/>
+            <w:tcBorders>
+              <w:top w:val="single" w:color="BFBFBF" w:sz="4"/>
+              <w:left w:val="single" w:color="BFBFBF" w:sz="4"/>
+              <w:bottom w:val="single" w:color="BFBFBF" w:sz="4"/>
+              <w:right w:val="single" w:color="BFBFBF" w:sz="4"/>
+            </w:tcBorders>
+            <w:tcMar>
+              <w:top w:type="dxa" w:w="36"/>
+              <w:left w:type="dxa" w:w="70"/>
+              <w:bottom w:type="dxa" w:w="36"/>
+              <w:right w:type="dxa" w:w="70"/>
+            </w:tcMar>
+            <w:vAlign w:val="center"/>
+          </w:tcPr>
+          <w:p>
+            <w:pPr>
+              <w:spacing w:after="26" w:before="26" w:line="216"/>
+              <w:jc w:val="center"/>
+            </w:pPr>
+            <w:r>
+              <w:rPr>
+                <w:rFonts w:ascii="Calibri" w:cs="Calibri" w:eastAsia="Calibri" w:hAnsi="Calibri"/>
+                <w:color w:val="000000"/>
+                <w:sz w:val="17"/>
+                <w:szCs w:val="17"/>
+              </w:rPr>
+              <w:t xml:space="preserve">M. Cyril ABOLY — Conseiller Juridique / MEDD</w:t>
+            </w:r>
+          </w:p>
+        </w:tc>
+        <w:tc>
+          <w:tcPr>
+            <w:tcW w:type="dxa" w:w="2436"/>
+            <w:tcBorders>
+              <w:top w:val="single" w:color="BFBFBF" w:sz="4"/>
+              <w:left w:val="single" w:color="BFBFBF" w:sz="4"/>
+              <w:bottom w:val="single" w:color="BFBFBF" w:sz="4"/>
+              <w:right w:val="single" w:color="BFBFBF" w:sz="4"/>
+            </w:tcBorders>
+            <w:tcMar>
+              <w:top w:type="dxa" w:w="36"/>
+              <w:left w:type="dxa" w:w="70"/>
+              <w:bottom w:type="dxa" w:w="36"/>
+              <w:right w:type="dxa" w:w="70"/>
+            </w:tcMar>
+            <w:vAlign w:val="center"/>
+          </w:tcPr>
+          <w:p>
+            <w:pPr>
+              <w:spacing w:after="26" w:before="26" w:line="216"/>
+              <w:jc w:val="center"/>
+            </w:pPr>
+            <w:r>
+              <w:rPr>
+                <w:rFonts w:ascii="Calibri" w:cs="Calibri" w:eastAsia="Calibri" w:hAnsi="Calibri"/>
+                <w:color w:val="000000"/>
+                <w:sz w:val="17"/>
+                <w:szCs w:val="17"/>
+              </w:rPr>
+              <w:t xml:space="preserve">M. Mamadou Bobo BAH — DNA / MATD</w:t>
+            </w:r>
+          </w:p>
+        </w:tc>
+        <w:tc>
+          <w:tcPr>
+            <w:tcW w:type="dxa" w:w="2437"/>
+            <w:tcBorders>
+              <w:top w:val="single" w:color="BFBFBF" w:sz="4"/>
+              <w:left w:val="single" w:color="BFBFBF" w:sz="4"/>
+              <w:bottom w:val="single" w:color="BFBFBF" w:sz="4"/>
+              <w:right w:val="single" w:color="BFBFBF" w:sz="4"/>
+            </w:tcBorders>
+            <w:tcMar>
+              <w:top w:type="dxa" w:w="36"/>
+              <w:left w:type="dxa" w:w="70"/>
+              <w:bottom w:type="dxa" w:w="36"/>
+              <w:right w:type="dxa" w:w="70"/>
+            </w:tcMar>
+            <w:vAlign w:val="center"/>
+          </w:tcPr>
+          <w:p>
+            <w:pPr>
+              <w:spacing w:after="26" w:before="26" w:line="216"/>
+              <w:jc w:val="center"/>
+            </w:pPr>
+            <w:r>
+              <w:rPr>
+                <w:rFonts w:ascii="Calibri" w:cs="Calibri" w:eastAsia="Calibri" w:hAnsi="Calibri"/>
+                <w:color w:val="000000"/>
+                <w:sz w:val="17"/>
+                <w:szCs w:val="17"/>
+              </w:rPr>
+              <w:t xml:space="preserve">M. Sanassy SIDIBE — BSD / Ministère de l'Énergie</w:t>
+            </w:r>
+          </w:p>
+        </w:tc>
+        <w:tc>
+          <w:tcPr>
+            <w:tcW w:type="dxa" w:w="2437"/>
+            <w:tcBorders>
+              <w:top w:val="single" w:color="BFBFBF" w:sz="4"/>
+              <w:left w:val="single" w:color="BFBFBF" w:sz="4"/>
+              <w:bottom w:val="single" w:color="BFBFBF" w:sz="4"/>
+              <w:right w:val="single" w:color="BFBFBF" w:sz="4"/>
+            </w:tcBorders>
+            <w:tcMar>
+              <w:top w:type="dxa" w:w="36"/>
+              <w:left w:type="dxa" w:w="70"/>
+              <w:bottom w:type="dxa" w:w="36"/>
+              <w:right w:type="dxa" w:w="70"/>
+            </w:tcMar>
+            <w:vAlign w:val="center"/>
+          </w:tcPr>
+          <w:p>
+            <w:pPr>
+              <w:spacing w:after="26" w:before="26" w:line="216"/>
+              <w:jc w:val="center"/>
+            </w:pPr>
+            <w:r>
+              <w:rPr>
+                <w:rFonts w:ascii="Calibri" w:cs="Calibri" w:eastAsia="Calibri" w:hAnsi="Calibri"/>
+                <w:color w:val="000000"/>
+                <w:sz w:val="17"/>
+                <w:szCs w:val="17"/>
+              </w:rPr>
+              <w:t xml:space="preserve">M. Sory DOUMBOUYA — AGEE</w:t>
+            </w:r>
+          </w:p>
+        </w:tc>
+      </w:tr>
+      <w:tr>
+        <w:trPr>
+          <w:tblHeader w:val="false"/>
+        </w:trPr>
+        <w:tc>
+          <w:tcPr>
+            <w:tcW w:type="dxa" w:w="4872"/>
+            <w:gridSpan w:val="2"/>
+            <w:tcBorders>
+              <w:top w:val="single" w:color="BFBFBF" w:sz="4"/>
+              <w:left w:val="single" w:color="BFBFBF" w:sz="4"/>
+              <w:bottom w:val="single" w:color="BFBFBF" w:sz="4"/>
+              <w:right w:val="single" w:color="BFBFBF" w:sz="4"/>
+            </w:tcBorders>
+            <w:shd w:fill="DEEAF6" w:color="auto" w:val="clear"/>
+            <w:tcMar>
+              <w:top w:type="dxa" w:w="36"/>
+              <w:left w:type="dxa" w:w="70"/>
+              <w:bottom w:type="dxa" w:w="36"/>
+              <w:right w:type="dxa" w:w="70"/>
+            </w:tcMar>
+            <w:vAlign w:val="center"/>
+          </w:tcPr>
+          <w:p>
+            <w:pPr>
+              <w:spacing w:after="26" w:before="26" w:line="216"/>
+              <w:jc w:val="center"/>
+            </w:pPr>
+            <w:r>
+              <w:rPr>
+                <w:rFonts w:ascii="Calibri" w:cs="Calibri" w:eastAsia="Calibri" w:hAnsi="Calibri"/>
+                <w:b/>
+                <w:bCs/>
+                <w:color w:val="000000"/>
+                <w:sz w:val="17"/>
+                <w:szCs w:val="17"/>
+              </w:rPr>
+              <w:t xml:space="preserve">Le Promoteur</w:t>
+            </w:r>
+          </w:p>
+        </w:tc>
+        <w:tc>
+          <w:tcPr>
+            <w:tcW w:type="dxa" w:w="4873"/>
+            <w:gridSpan w:val="2"/>
+            <w:tcBorders>
+              <w:top w:val="single" w:color="BFBFBF" w:sz="4"/>
+              <w:left w:val="single" w:color="BFBFBF" w:sz="4"/>
+              <w:bottom w:val="single" w:color="BFBFBF" w:sz="4"/>
+              <w:right w:val="single" w:color="BFBFBF" w:sz="4"/>
+            </w:tcBorders>
+            <w:shd w:fill="DEEAF6" w:color="auto" w:val="clear"/>
+            <w:tcMar>
+              <w:top w:type="dxa" w:w="36"/>
+              <w:left w:type="dxa" w:w="70"/>
+              <w:bottom w:type="dxa" w:w="36"/>
+              <w:right w:type="dxa" w:w="70"/>
+            </w:tcMar>
+            <w:vAlign w:val="center"/>
+          </w:tcPr>
+          <w:p>
+            <w:pPr>
+              <w:spacing w:after="26" w:before="26" w:line="216"/>
+              <w:jc w:val="center"/>
+            </w:pPr>
+            <w:r>
+              <w:rPr>
+                <w:rFonts w:ascii="Calibri" w:cs="Calibri" w:eastAsia="Calibri" w:hAnsi="Calibri"/>
+                <w:b/>
+                <w:bCs/>
+                <w:color w:val="000000"/>
+                <w:sz w:val="17"/>
+                <w:szCs w:val="17"/>
+              </w:rPr>
+              <w:t xml:space="preserve">Le Consultant</w:t>
+            </w:r>
+          </w:p>
+        </w:tc>
+      </w:tr>
+      <w:tr>
+        <w:trPr>
+          <w:tblHeader w:val="false"/>
+        </w:trPr>
+        <w:tc>
+          <w:tcPr>
+            <w:tcW w:type="dxa" w:w="4872"/>
+            <w:gridSpan w:val="2"/>
+            <w:tcBorders>
+              <w:top w:val="single" w:color="BFBFBF" w:sz="4"/>
+              <w:left w:val="single" w:color="BFBFBF" w:sz="4"/>
+              <w:bottom w:val="single" w:color="BFBFBF" w:sz="4"/>
+              <w:right w:val="single" w:color="BFBFBF" w:sz="4"/>
+            </w:tcBorders>
+            <w:tcMar>
+              <w:top w:type="dxa" w:w="36"/>
+              <w:left w:type="dxa" w:w="70"/>
+              <w:bottom w:type="dxa" w:w="36"/>
+              <w:right w:type="dxa" w:w="70"/>
+            </w:tcMar>
+            <w:vAlign w:val="center"/>
+          </w:tcPr>
+          <w:p>
+            <w:pPr>
+              <w:spacing w:after="26" w:before="26" w:line="216"/>
+              <w:jc w:val="center"/>
+            </w:pPr>
+            <w:r>
+              <w:rPr>
+                <w:rFonts w:ascii="Calibri" w:cs="Calibri" w:eastAsia="Calibri" w:hAnsi="Calibri"/>
+                <w:color w:val="000000"/>
+                <w:sz w:val="17"/>
+                <w:szCs w:val="17"/>
+              </w:rPr>
+              <w:t xml:space="preserve">M. Namory BAKAYOKO — KAMA SA</w:t>
+            </w:r>
+          </w:p>
+        </w:tc>
+        <w:tc>
+          <w:tcPr>
+            <w:tcW w:type="dxa" w:w="4873"/>
+            <w:gridSpan w:val="2"/>
+            <w:tcBorders>
+              <w:top w:val="single" w:color="BFBFBF" w:sz="4"/>
+              <w:left w:val="single" w:color="BFBFBF" w:sz="4"/>
+              <w:bottom w:val="single" w:color="BFBFBF" w:sz="4"/>
+              <w:right w:val="single" w:color="BFBFBF" w:sz="4"/>
+            </w:tcBorders>
+            <w:tcMar>
+              <w:top w:type="dxa" w:w="36"/>
+              <w:left w:type="dxa" w:w="70"/>
+              <w:bottom w:type="dxa" w:w="36"/>
+              <w:right w:type="dxa" w:w="70"/>
+            </w:tcMar>
+            <w:vAlign w:val="center"/>
+          </w:tcPr>
+          <w:p>
+            <w:pPr>
+              <w:spacing w:after="26" w:before="26" w:line="216"/>
+              <w:jc w:val="center"/>
+            </w:pPr>
+            <w:r>
+              <w:rPr>
+                <w:rFonts w:ascii="Calibri" w:cs="Calibri" w:eastAsia="Calibri" w:hAnsi="Calibri"/>
+                <w:color w:val="000000"/>
+                <w:sz w:val="17"/>
+                <w:szCs w:val="17"/>
+              </w:rPr>
+              <w:t xml:space="preserve">Dr Mindri IDANI — CGDEM-AEDD SARLU</w:t>
+            </w:r>
+          </w:p>
+        </w:tc>
+      </w:tr>
+    </w:tbl>
+    <w:p>
+      <w:pPr>
+        <w:pBdr>
+          <w:top w:val="single" w:color="BFBFBF" w:sz="6" w:space="4"/>
+        </w:pBdr>
+        <w:spacing w:before="100"/>
+      </w:pPr>
+      <w:r>
+        <w:rPr>
+          <w:rFonts w:ascii="Calibri" w:cs="Calibri" w:eastAsia="Calibri" w:hAnsi="Calibri"/>
+          <w:i/>
+          <w:iCs/>
+          <w:color w:val="595959"/>
+          <w:sz w:val="15"/>
+          <w:szCs w:val="15"/>
+        </w:rPr>
+        <w:t xml:space="preserve">Source : Procès-verbal de délibération, session n° 0170/CTAE/AGEE/DG/CONAKRY du 14/07/2026, signé le 14 juillet 2026 (7 pages).</w:t>
       </w:r>
     </w:p>
     <w:sectPr>

</xml_diff>